<commit_message>
Revise evaluation report with realistic Australian agtech financial model: CAPEX 18900 AUD, OPEX 280 AUD/mo, Monthly Inflow 1027 AUD/mo, Farmer Uplift 95.5 percent
</commit_message>
<xml_diff>
--- a/docx/evaluation_report.docx
+++ b/docx/evaluation_report.docx
@@ -242,7 +242,7 @@
           <w:color w:val="1E293B"/>
           <w:sz w:val="20"/>
         </w:rPr>
-        <w:t>AgriTrace operates on a sustainable multi-stream revenue model in Australian Dollars ($ AUD). By eliminating predatory supermarket middlemen (who capture 50–60% markups), AgriTrace charges modest, transparent utility fees that generate strong recurring operational profit while increasing small farmer take-home earnings by +36%.</w:t>
+        <w:t>AgriTrace operates on a lean, sustainable multi-stream revenue model in Australian Dollars ($ AUD). By eliminating predatory supermarket middlemen (who capture 50–60% markups), AgriTrace charges modest, transparent utility fees that generate reliable recurring operational cash flow while increasing small farmer take-home earnings by +95.5%.</w:t>
       </w:r>
     </w:p>
     <w:tbl>
@@ -389,7 +389,7 @@
                 <w:color w:val="1E293B"/>
                 <w:sz w:val="18"/>
               </w:rPr>
-              <w:t>$75,400 AUD</w:t>
+              <w:t>$18,900 AUD</w:t>
             </w:r>
           </w:p>
         </w:tc>
@@ -415,7 +415,7 @@
                 <w:color w:val="1E293B"/>
                 <w:sz w:val="18"/>
               </w:rPr>
-              <w:t>One-time complete software build and testing budget</w:t>
+              <w:t>Lean MVP software build across 220 contractor hours @ standard rates</w:t>
             </w:r>
           </w:p>
         </w:tc>
@@ -469,7 +469,7 @@
                 <w:color w:val="1E293B"/>
                 <w:sz w:val="18"/>
               </w:rPr>
-              <w:t>$1,790 AUD / month</w:t>
+              <w:t>$280.00 AUD / month</w:t>
             </w:r>
           </w:p>
         </w:tc>
@@ -495,7 +495,7 @@
                 <w:color w:val="1E293B"/>
                 <w:sz w:val="18"/>
               </w:rPr>
-              <w:t>Recurring Firebase, domain, security, and ops run-rate</w:t>
+              <w:t>Serverless Firebase Blaze, domain, automated backups &amp; triage</w:t>
             </w:r>
           </w:p>
         </w:tc>
@@ -549,7 +549,7 @@
                 <w:color w:val="1E293B"/>
                 <w:sz w:val="18"/>
               </w:rPr>
-              <w:t>$9,812.50 AUD / month</w:t>
+              <w:t>$1,027.00 AUD / month</w:t>
             </w:r>
           </w:p>
         </w:tc>
@@ -603,7 +603,7 @@
                 <w:color w:val="1E293B"/>
                 <w:sz w:val="18"/>
               </w:rPr>
-              <w:t>Monthly Net Cash Profit</w:t>
+              <w:t>Monthly Net Operating Cash Flow</w:t>
             </w:r>
           </w:p>
         </w:tc>
@@ -629,7 +629,7 @@
                 <w:color w:val="1E293B"/>
                 <w:sz w:val="18"/>
               </w:rPr>
-              <w:t>$8,022.50 AUD / month</w:t>
+              <w:t>$747.00 AUD / month</w:t>
             </w:r>
           </w:p>
         </w:tc>
@@ -709,7 +709,7 @@
                 <w:color w:val="1E293B"/>
                 <w:sz w:val="18"/>
               </w:rPr>
-              <w:t>$96,270 AUD / year</w:t>
+              <w:t>$8,964 AUD / year</w:t>
             </w:r>
           </w:p>
         </w:tc>
@@ -735,7 +735,7 @@
                 <w:color w:val="1E293B"/>
                 <w:sz w:val="18"/>
               </w:rPr>
-              <w:t>Sustained net cash flow generated at initial regional capacity</w:t>
+              <w:t>Sustained net cash flow generated at 15-farm pilot capacity</w:t>
             </w:r>
           </w:p>
         </w:tc>
@@ -789,7 +789,7 @@
                 <w:color w:val="1E293B"/>
                 <w:sz w:val="18"/>
               </w:rPr>
-              <w:t>9.4 Months</w:t>
+              <w:t>2.1 Years (or &lt;1 yr w/ grant)</w:t>
             </w:r>
           </w:p>
         </w:tc>
@@ -815,7 +815,7 @@
                 <w:color w:val="1E293B"/>
                 <w:sz w:val="18"/>
               </w:rPr>
-              <w:t>Time required to fully recoup initial $75,400 AUD CAPEX</w:t>
+              <w:t>Full payback on $18,900 AUD CAPEX (11.9 mos with $10k agtech grant)</w:t>
             </w:r>
           </w:p>
         </w:tc>
@@ -843,7 +843,7 @@
                 <w:color w:val="1E293B"/>
                 <w:sz w:val="18"/>
               </w:rPr>
-              <w:t>Farmer Margin Uplift</w:t>
+              <w:t>Farmer Income Gain (Take-Home)</w:t>
             </w:r>
           </w:p>
         </w:tc>
@@ -869,7 +869,7 @@
                 <w:color w:val="1E293B"/>
                 <w:sz w:val="18"/>
               </w:rPr>
-              <w:t>+36% Net Gain</w:t>
+              <w:t>+$10,320 AUD / yr / farm</w:t>
             </w:r>
           </w:p>
         </w:tc>
@@ -895,7 +895,7 @@
                 <w:color w:val="1E293B"/>
                 <w:sz w:val="18"/>
               </w:rPr>
-              <w:t>Additional profit captured by small growers vs. supermarket duopolies</w:t>
+              <w:t>+95.5% net margin uplift per small family producer vs supermarket wholesale</w:t>
             </w:r>
           </w:p>
         </w:tc>
@@ -969,7 +969,7 @@
       <w:r>
         <w:drawing>
           <wp:inline xmlns:a="http://schemas.openxmlformats.org/drawingml/2006/main" xmlns:pic="http://schemas.openxmlformats.org/drawingml/2006/picture">
-            <wp:extent cx="5486400" cy="4114800"/>
+            <wp:extent cx="5486400" cy="3587262"/>
             <wp:docPr id="2" name="Picture 2"/>
             <wp:cNvGraphicFramePr>
               <a:graphicFrameLocks noChangeAspect="1"/>
@@ -990,7 +990,7 @@
                   <pic:spPr>
                     <a:xfrm>
                       <a:off x="0" y="0"/>
-                      <a:ext cx="5486400" cy="4114800"/>
+                      <a:ext cx="5486400" cy="3587262"/>
                     </a:xfrm>
                     <a:prstGeom prst="rect"/>
                   </pic:spPr>
@@ -1041,7 +1041,7 @@
           <w:color w:val="1E293B"/>
           <w:sz w:val="20"/>
         </w:rPr>
-        <w:t>The platform does not rely on intrusive advertising or data brokerage. Revenue is earned through four transparent commercial charges:</w:t>
+        <w:t>The platform does not rely on speculative ad clicks or personal data resale. Revenue is earned through four realistic, transparent commercial charges designed for smallholder agriculture:</w:t>
       </w:r>
     </w:p>
     <w:p>
@@ -1056,7 +1056,7 @@
           <w:color w:val="2E7D32"/>
           <w:sz w:val="26"/>
         </w:rPr>
-        <w:t>Charge Stream 1: Fair-Trade Transaction Commission (2.5%)</w:t>
+        <w:t>Charge Stream 1: Fair-Trade Transaction Commission (3.0%)</w:t>
       </w:r>
     </w:p>
     <w:p>
@@ -1069,7 +1069,7 @@
           <w:color w:val="1E293B"/>
           <w:sz w:val="20"/>
         </w:rPr>
-        <w:t>A 2.5% fair-trade processing fee is applied to the gross merchandise value (GMV) of every produce batch sold through the customer marketplace. Compared to the 50–60% deductions taken by major supermarket chains (Coles and Woolworths), a 2.5% transparent fee is universally embraced by growers.</w:t>
+        <w:t>A 3.0% fair-trade processing fee is applied to the gross merchandise value (GMV) of produce ordered through the customer marketplace. Compared to the 50–60% deductions taken by major supermarket chains (Coles and Woolworths), a 3.0% transparent fee is universally embraced by growers.</w:t>
       </w:r>
     </w:p>
     <w:p>
@@ -1084,7 +1084,7 @@
           <w:color w:val="1E293B"/>
           <w:sz w:val="20"/>
         </w:rPr>
-        <w:t xml:space="preserve">Calculation: </w:t>
+        <w:t xml:space="preserve">Basket Size: </w:t>
       </w:r>
       <w:r>
         <w:rPr>
@@ -1092,7 +1092,7 @@
           <w:color w:val="1E293B"/>
           <w:sz w:val="20"/>
         </w:rPr>
-        <w:t>Average Regional Order Size: $45.00 AUD (e.g. 2 punnets strawberries, 1kg carrots, avocados, honey).</w:t>
+        <w:t>Average Regional Order Size: $44.00 AUD (e.g. seasonal vegetable box, 2 punnets strawberries, farm honey).</w:t>
       </w:r>
     </w:p>
     <w:p>
@@ -1115,7 +1115,7 @@
           <w:color w:val="1E293B"/>
           <w:sz w:val="20"/>
         </w:rPr>
-        <w:t>Monthly Transaction Volume: 1,500 customer orders across 20 participating Victorian family farms.</w:t>
+        <w:t>Monthly Transaction Volume: 350 customer orders across 15 participating regional Victorian family farms.</w:t>
       </w:r>
     </w:p>
     <w:p>
@@ -1138,7 +1138,7 @@
           <w:color w:val="1E293B"/>
           <w:sz w:val="20"/>
         </w:rPr>
-        <w:t>Monthly Gross Merchandise Value (GMV): 1,500 orders × $45.00 = $67,500.00 AUD.</w:t>
+        <w:t>Monthly Gross Merchandise Value (GMV): 350 orders × $44.00 = $15,400.00 AUD / month.</w:t>
       </w:r>
     </w:p>
     <w:p>
@@ -1161,7 +1161,7 @@
           <w:color w:val="1E293B"/>
           <w:sz w:val="20"/>
         </w:rPr>
-        <w:t>Real Money Revenue: $67,500 × 2.5% = $1,687.50 AUD / month ($20,250 AUD / year).</w:t>
+        <w:t>Real Money Revenue: $15,400 × 3.0% = $462.00 AUD / month ($5,544.00 AUD / year).</w:t>
       </w:r>
     </w:p>
     <w:p>
@@ -1176,7 +1176,7 @@
           <w:color w:val="2E7D32"/>
           <w:sz w:val="26"/>
         </w:rPr>
-        <w:t>Charge Stream 2: Wholesaler Commercial Accreditation Fee ($120 AUD / mo)</w:t>
+        <w:t>Charge Stream 2: Commercial Wholesaler &amp; Buyer Verification Fee ($35.00 AUD / mo)</w:t>
       </w:r>
     </w:p>
     <w:p>
@@ -1189,7 +1189,7 @@
           <w:color w:val="1E293B"/>
           <w:sz w:val="20"/>
         </w:rPr>
-        <w:t>Accredited commercial wholesalers pay a monthly subscription fee for access to the verified grower directory, automated batch quality certificates, and priority logistics routing.</w:t>
+        <w:t>Accredited commercial wholesalers, independent grocers, and farm-to-table restaurants pay a modest monthly subscription fee for access to pre-verified batch quality certificates, biosecurity compliance records, and direct bulk purchasing.</w:t>
       </w:r>
     </w:p>
     <w:p>
@@ -1212,7 +1212,7 @@
           <w:color w:val="1E293B"/>
           <w:sz w:val="20"/>
         </w:rPr>
-        <w:t>Standard Wholesaler Monthly Fee: $120.00 AUD / month (or $1,200 AUD / year billed annually).</w:t>
+        <w:t>Wholesaler Monthly Fee: $35.00 AUD / month (or $350.00 AUD / year billed annually).</w:t>
       </w:r>
     </w:p>
     <w:p>
@@ -1235,7 +1235,7 @@
           <w:color w:val="1E293B"/>
           <w:sz w:val="20"/>
         </w:rPr>
-        <w:t>Participating Accredited Wholesalers: 25 commercial regional distributors (Melbourne, Sydney, Geelong).</w:t>
+        <w:t>Pilot Cohort: 8 accredited regional commercial buyers / distributors.</w:t>
       </w:r>
     </w:p>
     <w:p>
@@ -1258,7 +1258,7 @@
           <w:color w:val="1E293B"/>
           <w:sz w:val="20"/>
         </w:rPr>
-        <w:t>Real Money Revenue: 25 wholesalers × $120.00 = $3,000.00 AUD / month ($36,000 AUD / year).</w:t>
+        <w:t>Real Money Revenue: 8 buyers × $35.00 = $280.00 AUD / month ($3,360.00 AUD / year).</w:t>
       </w:r>
     </w:p>
     <w:p>
@@ -1273,7 +1273,7 @@
           <w:color w:val="2E7D32"/>
           <w:sz w:val="26"/>
         </w:rPr>
-        <w:t>Charge Stream 3: Farm Cooperative Enterprise SaaS Tiers</w:t>
+        <w:t>Charge Stream 3: Farm Cooperative SaaS Tiers</w:t>
       </w:r>
     </w:p>
     <w:p>
@@ -1286,7 +1286,7 @@
           <w:color w:val="1E293B"/>
           <w:sz w:val="20"/>
         </w:rPr>
-        <w:t>To ensure fair access, micro-farms pay nothing. Larger family farms and regional cooperatives subscribe to advanced SaaS tools for batch traceability, temperature sensor telemetry, and export reporting:</w:t>
+        <w:t>To protect micro-producers, entry-level farms pay nothing. Commercial family farms and regional packing cooperatives subscribe to digital inventory and traceability tools:</w:t>
       </w:r>
     </w:p>
     <w:p>
@@ -1309,7 +1309,7 @@
           <w:color w:val="1E293B"/>
           <w:sz w:val="20"/>
         </w:rPr>
-        <w:t>Micro Grower Tier (Under $2,000 AUD/mo GMV): $0 / month (Free entry tier).</w:t>
+        <w:t>Micro Grower Starter Tier (Under 2 hectares): $0.00 / month (Free entry tier to maximize community adoption).</w:t>
       </w:r>
     </w:p>
     <w:p>
@@ -1332,7 +1332,7 @@
           <w:color w:val="1E293B"/>
           <w:sz w:val="20"/>
         </w:rPr>
-        <w:t>Commercial Family Farm Tier: $49.00 AUD / month. 30 subscribing commercial farms = $1,470.00 AUD / month.</w:t>
+        <w:t>Commercial Family Farm Tier: $15.00 AUD / month. 7 subscribing family farms = $105.00 AUD / month.</w:t>
       </w:r>
     </w:p>
     <w:p>
@@ -1355,7 +1355,7 @@
           <w:color w:val="1E293B"/>
           <w:sz w:val="20"/>
         </w:rPr>
-        <w:t>Regional Cooperative Hub Tier: $149.00 AUD / month. 20 subscribing regional cooperatives = $2,980.00 AUD / month.</w:t>
+        <w:t>Regional Cooperative / Packing Shed Tier: $45.00 AUD / month. 2 subscribing cooperative hubs = $90.00 AUD / month.</w:t>
       </w:r>
     </w:p>
     <w:p>
@@ -1378,7 +1378,7 @@
           <w:color w:val="1E293B"/>
           <w:sz w:val="20"/>
         </w:rPr>
-        <w:t>Real Money Revenue: $1,470 + $2,980 = $4,450.00 AUD / month ($53,400 AUD / year).</w:t>
+        <w:t>Real Money Revenue: $105 + $90 = $195.00 AUD / month ($2,340.00 AUD / year).</w:t>
       </w:r>
     </w:p>
     <w:p>
@@ -1393,7 +1393,7 @@
           <w:color w:val="2E7D32"/>
           <w:sz w:val="26"/>
         </w:rPr>
-        <w:t>Charge Stream 4: Cold-Chain Logistics Coordination Fee (1.0%)</w:t>
+        <w:t>Charge Stream 4: Digital QR Traceability &amp; Batch Verification Stamp ($0.20 AUD / batch)</w:t>
       </w:r>
     </w:p>
     <w:p>
@@ -1406,7 +1406,7 @@
           <w:color w:val="1E293B"/>
           <w:sz w:val="20"/>
         </w:rPr>
-        <w:t>Refrigerated freight partners utilize AgriTrace dispatch tools for cold-chain proof of delivery, paying a 1.0% digital coordination fee on all managed freight movements.</w:t>
+        <w:t>A micro-charge of $0.20 AUD is applied per verified batch QR verification seal generated for cold-chain cartons, proving tamper-proof origin and custody.</w:t>
       </w:r>
     </w:p>
     <w:p>
@@ -1421,7 +1421,7 @@
           <w:color w:val="1E293B"/>
           <w:sz w:val="20"/>
         </w:rPr>
-        <w:t xml:space="preserve">Base: </w:t>
+        <w:t xml:space="preserve">Volume: </w:t>
       </w:r>
       <w:r>
         <w:rPr>
@@ -1429,7 +1429,7 @@
           <w:color w:val="1E293B"/>
           <w:sz w:val="20"/>
         </w:rPr>
-        <w:t>Monthly Freight Movement Turnover: $67,500.00 AUD managed delivery volume.</w:t>
+        <w:t>Monthly Batch Volume: 450 verified produce batches / crates dispatched.</w:t>
       </w:r>
     </w:p>
     <w:p>
@@ -1452,7 +1452,7 @@
           <w:color w:val="1E293B"/>
           <w:sz w:val="20"/>
         </w:rPr>
-        <w:t>Real Money Revenue: $67,500 × 1.0% = $675.00 AUD / month ($8,100 AUD / year).</w:t>
+        <w:t>Real Money Revenue: 450 batches × $0.20 = $90.00 AUD / month ($1,080.00 AUD / year).</w:t>
       </w:r>
     </w:p>
     <w:p>
@@ -1642,7 +1642,7 @@
                 <w:color w:val="1E293B"/>
                 <w:sz w:val="18"/>
               </w:rPr>
-              <w:t>2.5% of GMV</w:t>
+              <w:t>3.0% of GMV</w:t>
             </w:r>
           </w:p>
         </w:tc>
@@ -1668,7 +1668,7 @@
                 <w:color w:val="1E293B"/>
                 <w:sz w:val="18"/>
               </w:rPr>
-              <w:t>$67,500 GMV (1,500 orders)</w:t>
+              <w:t>$15,400 GMV (350 orders)</w:t>
             </w:r>
           </w:p>
         </w:tc>
@@ -1694,7 +1694,7 @@
                 <w:color w:val="1E293B"/>
                 <w:sz w:val="18"/>
               </w:rPr>
-              <w:t>$1,687.50 AUD</w:t>
+              <w:t>$462.00 AUD</w:t>
             </w:r>
           </w:p>
         </w:tc>
@@ -1722,7 +1722,7 @@
                 <w:color w:val="1E293B"/>
                 <w:sz w:val="18"/>
               </w:rPr>
-              <w:t>Wholesaler Accreditation Fee</w:t>
+              <w:t>Wholesaler Verification Fee</w:t>
             </w:r>
           </w:p>
         </w:tc>
@@ -1748,7 +1748,7 @@
                 <w:color w:val="1E293B"/>
                 <w:sz w:val="18"/>
               </w:rPr>
-              <w:t>$120.00 AUD / month</w:t>
+              <w:t>$35.00 AUD / month</w:t>
             </w:r>
           </w:p>
         </w:tc>
@@ -1774,7 +1774,7 @@
                 <w:color w:val="1E293B"/>
                 <w:sz w:val="18"/>
               </w:rPr>
-              <w:t>25 commercial distributors</w:t>
+              <w:t>8 commercial buyers</w:t>
             </w:r>
           </w:p>
         </w:tc>
@@ -1800,7 +1800,7 @@
                 <w:color w:val="1E293B"/>
                 <w:sz w:val="18"/>
               </w:rPr>
-              <w:t>$3,000.00 AUD</w:t>
+              <w:t>$280.00 AUD</w:t>
             </w:r>
           </w:p>
         </w:tc>
@@ -1854,7 +1854,7 @@
                 <w:color w:val="1E293B"/>
                 <w:sz w:val="18"/>
               </w:rPr>
-              <w:t>$49 / $149 AUD / month</w:t>
+              <w:t>$15 / $45 AUD / month</w:t>
             </w:r>
           </w:p>
         </w:tc>
@@ -1880,7 +1880,7 @@
                 <w:color w:val="1E293B"/>
                 <w:sz w:val="18"/>
               </w:rPr>
-              <w:t>30 farms + 20 cooperatives</w:t>
+              <w:t>7 farms + 2 cooperatives</w:t>
             </w:r>
           </w:p>
         </w:tc>
@@ -1906,7 +1906,7 @@
                 <w:color w:val="1E293B"/>
                 <w:sz w:val="18"/>
               </w:rPr>
-              <w:t>$4,450.00 AUD</w:t>
+              <w:t>$195.00 AUD</w:t>
             </w:r>
           </w:p>
         </w:tc>
@@ -1934,7 +1934,7 @@
                 <w:color w:val="1E293B"/>
                 <w:sz w:val="18"/>
               </w:rPr>
-              <w:t>Cold-Chain Logistics Coordination</w:t>
+              <w:t>Digital QR Batch Stamp Fee</w:t>
             </w:r>
           </w:p>
         </w:tc>
@@ -1960,7 +1960,7 @@
                 <w:color w:val="1E293B"/>
                 <w:sz w:val="18"/>
               </w:rPr>
-              <w:t>1.0% dispatch fee</w:t>
+              <w:t>$0.20 AUD / batch</w:t>
             </w:r>
           </w:p>
         </w:tc>
@@ -1986,7 +1986,7 @@
                 <w:color w:val="1E293B"/>
                 <w:sz w:val="18"/>
               </w:rPr>
-              <w:t>$67,500 logistics volume</w:t>
+              <w:t>450 verified batches</w:t>
             </w:r>
           </w:p>
         </w:tc>
@@ -2012,7 +2012,7 @@
                 <w:color w:val="1E293B"/>
                 <w:sz w:val="18"/>
               </w:rPr>
-              <w:t>$675.00 AUD</w:t>
+              <w:t>$90.00 AUD</w:t>
             </w:r>
           </w:p>
         </w:tc>
@@ -2118,7 +2118,7 @@
                 <w:color w:val="1E293B"/>
                 <w:sz w:val="18"/>
               </w:rPr>
-              <w:t>$9,812.50 AUD / mo</w:t>
+              <w:t>$1,027.00 AUD / mo</w:t>
             </w:r>
           </w:p>
         </w:tc>
@@ -2141,7 +2141,7 @@
           <w:color w:val="1B4D20"/>
           <w:sz w:val="32"/>
         </w:rPr>
-        <w:t>3. Initial Capital Expenditure (CAPEX) — Total: $75,400 AUD</w:t>
+        <w:t>3. Initial Capital Expenditure (CAPEX) — Total: $18,900 AUD</w:t>
       </w:r>
     </w:p>
     <w:p>
@@ -2154,7 +2154,7 @@
           <w:color w:val="1E293B"/>
           <w:sz w:val="20"/>
         </w:rPr>
-        <w:t>Initial software development, security hardening, user experience design, and testing were costed based on prevailing Australian engineering contractor rates ($120 AUD/hr):</w:t>
+        <w:t>Initial software development, security hardening, user experience design, and testing were costed based on prevailing Australian engineering contractor rates ($75 – $95 AUD/hr) for a lean, agile MVP:</w:t>
       </w:r>
     </w:p>
     <w:tbl>
@@ -2303,7 +2303,7 @@
                 <w:color w:val="1E293B"/>
                 <w:sz w:val="18"/>
               </w:rPr>
-              <w:t>System Architecture &amp; Design</w:t>
+              <w:t>System Architecture &amp; Schema</w:t>
             </w:r>
           </w:p>
         </w:tc>
@@ -2329,7 +2329,7 @@
                 <w:color w:val="1E293B"/>
                 <w:sz w:val="18"/>
               </w:rPr>
-              <w:t>Database schema, security models, biosecurity compliance</w:t>
+              <w:t>Firestore database collections, role rules, biosecurity flow</w:t>
             </w:r>
           </w:p>
         </w:tc>
@@ -2355,7 +2355,7 @@
                 <w:color w:val="1E293B"/>
                 <w:sz w:val="18"/>
               </w:rPr>
-              <w:t>70 hrs</w:t>
+              <w:t>24 hrs</w:t>
             </w:r>
           </w:p>
         </w:tc>
@@ -2381,7 +2381,7 @@
                 <w:color w:val="1E293B"/>
                 <w:sz w:val="18"/>
               </w:rPr>
-              <w:t>$8,400 AUD</w:t>
+              <w:t>$2,280 AUD</w:t>
             </w:r>
           </w:p>
         </w:tc>
@@ -2461,7 +2461,7 @@
                 <w:color w:val="1E293B"/>
                 <w:sz w:val="18"/>
               </w:rPr>
-              <w:t>50 hrs</w:t>
+              <w:t>36 hrs</w:t>
             </w:r>
           </w:p>
         </w:tc>
@@ -2487,7 +2487,7 @@
                 <w:color w:val="1E293B"/>
                 <w:sz w:val="18"/>
               </w:rPr>
-              <w:t>$6,000 AUD</w:t>
+              <w:t>$3,060 AUD</w:t>
             </w:r>
           </w:p>
         </w:tc>
@@ -2567,7 +2567,7 @@
                 <w:color w:val="1E293B"/>
                 <w:sz w:val="18"/>
               </w:rPr>
-              <w:t>240 hrs</w:t>
+              <w:t>72 hrs</w:t>
             </w:r>
           </w:p>
         </w:tc>
@@ -2593,7 +2593,7 @@
                 <w:color w:val="1E293B"/>
                 <w:sz w:val="18"/>
               </w:rPr>
-              <w:t>$28,800 AUD</w:t>
+              <w:t>$6,480 AUD</w:t>
             </w:r>
           </w:p>
         </w:tc>
@@ -2673,7 +2673,7 @@
                 <w:color w:val="1E293B"/>
                 <w:sz w:val="18"/>
               </w:rPr>
-              <w:t>128 hrs</w:t>
+              <w:t>28 hrs</w:t>
             </w:r>
           </w:p>
         </w:tc>
@@ -2699,7 +2699,7 @@
                 <w:color w:val="1E293B"/>
                 <w:sz w:val="18"/>
               </w:rPr>
-              <w:t>$15,400 AUD</w:t>
+              <w:t>$2,240 AUD</w:t>
             </w:r>
           </w:p>
         </w:tc>
@@ -2727,7 +2727,7 @@
                 <w:color w:val="1E293B"/>
                 <w:sz w:val="18"/>
               </w:rPr>
-              <w:t>Australian Regional Seed &amp; Docs</w:t>
+              <w:t>Documentation &amp; User Manuals</w:t>
             </w:r>
           </w:p>
         </w:tc>
@@ -2753,7 +2753,7 @@
                 <w:color w:val="1E293B"/>
                 <w:sz w:val="18"/>
               </w:rPr>
-              <w:t>seed.html, User Manual, Installation Manual, Site Map</w:t>
+              <w:t>User Manual, Installation Guide, Visual Site Map, Seeder</w:t>
             </w:r>
           </w:p>
         </w:tc>
@@ -2779,7 +2779,7 @@
                 <w:color w:val="1E293B"/>
                 <w:sz w:val="18"/>
               </w:rPr>
-              <w:t>60 hrs</w:t>
+              <w:t>20 hrs</w:t>
             </w:r>
           </w:p>
         </w:tc>
@@ -2805,7 +2805,7 @@
                 <w:color w:val="1E293B"/>
                 <w:sz w:val="18"/>
               </w:rPr>
-              <w:t>$7,200 AUD</w:t>
+              <w:t>$1,500 AUD</w:t>
             </w:r>
           </w:p>
         </w:tc>
@@ -2833,7 +2833,7 @@
                 <w:color w:val="1E293B"/>
                 <w:sz w:val="18"/>
               </w:rPr>
-              <w:t>Contingency &amp; Deployment Buffer</w:t>
+              <w:t>Pilot Deployment &amp; Farm Onboarding</w:t>
             </w:r>
           </w:p>
         </w:tc>
@@ -2859,7 +2859,7 @@
                 <w:color w:val="1E293B"/>
                 <w:sz w:val="18"/>
               </w:rPr>
-              <w:t>15% technical buffer for production hardening</w:t>
+              <w:t>Onboarding 15 pilot farms in Yarra Valley / Mornington</w:t>
             </w:r>
           </w:p>
         </w:tc>
@@ -2885,7 +2885,7 @@
                 <w:color w:val="1E293B"/>
                 <w:sz w:val="18"/>
               </w:rPr>
-              <w:t>80 hrs</w:t>
+              <w:t>20 hrs</w:t>
             </w:r>
           </w:p>
         </w:tc>
@@ -2911,7 +2911,7 @@
                 <w:color w:val="1E293B"/>
                 <w:sz w:val="18"/>
               </w:rPr>
-              <w:t>$9,600 AUD</w:t>
+              <w:t>$1,600 AUD</w:t>
             </w:r>
           </w:p>
         </w:tc>
@@ -2939,7 +2939,7 @@
                 <w:color w:val="1E293B"/>
                 <w:sz w:val="18"/>
               </w:rPr>
-              <w:t>TOTAL DEVELOPMENT (CAPEX)</w:t>
+              <w:t>Contingency &amp; Production Buffer</w:t>
             </w:r>
           </w:p>
         </w:tc>
@@ -2965,7 +2965,7 @@
                 <w:color w:val="1E293B"/>
                 <w:sz w:val="18"/>
               </w:rPr>
-              <w:t>Full Production Turnkey Release</w:t>
+              <w:t>10% technical buffer for production hardening</w:t>
             </w:r>
           </w:p>
         </w:tc>
@@ -2991,7 +2991,7 @@
                 <w:color w:val="1E293B"/>
                 <w:sz w:val="18"/>
               </w:rPr>
-              <w:t>628 hrs</w:t>
+              <w:t>20 hrs</w:t>
             </w:r>
           </w:p>
         </w:tc>
@@ -3017,7 +3017,113 @@
                 <w:color w:val="1E293B"/>
                 <w:sz w:val="18"/>
               </w:rPr>
-              <w:t>$75,400 AUD</w:t>
+              <w:t>$1,740 AUD</w:t>
+            </w:r>
+          </w:p>
+        </w:tc>
+      </w:tr>
+      <w:tr>
+        <w:tc>
+          <w:tcPr>
+            <w:tcW w:type="dxa" w:w="2736"/>
+            <w:shd w:fill="F8FAFC"/>
+            <w:tcMar>
+              <w:top w:w="100" w:type="dxa"/>
+              <w:bottom w:w="100" w:type="dxa"/>
+              <w:left w:w="140" w:type="dxa"/>
+              <w:right w:w="140" w:type="dxa"/>
+            </w:tcMar>
+          </w:tcPr>
+          <w:p>
+            <w:pPr>
+              <w:spacing w:before="0" w:after="0"/>
+              <w:jc w:val="left"/>
+            </w:pPr>
+            <w:r>
+              <w:rPr>
+                <w:rFonts w:ascii="Calibri" w:hAnsi="Calibri"/>
+                <w:color w:val="1E293B"/>
+                <w:sz w:val="18"/>
+              </w:rPr>
+              <w:t>TOTAL DEVELOPMENT (CAPEX)</w:t>
+            </w:r>
+          </w:p>
+        </w:tc>
+        <w:tc>
+          <w:tcPr>
+            <w:tcW w:type="dxa" w:w="3600"/>
+            <w:shd w:fill="F8FAFC"/>
+            <w:tcMar>
+              <w:top w:w="100" w:type="dxa"/>
+              <w:bottom w:w="100" w:type="dxa"/>
+              <w:left w:w="140" w:type="dxa"/>
+              <w:right w:w="140" w:type="dxa"/>
+            </w:tcMar>
+          </w:tcPr>
+          <w:p>
+            <w:pPr>
+              <w:spacing w:before="0" w:after="0"/>
+              <w:jc w:val="left"/>
+            </w:pPr>
+            <w:r>
+              <w:rPr>
+                <w:rFonts w:ascii="Calibri" w:hAnsi="Calibri"/>
+                <w:color w:val="1E293B"/>
+                <w:sz w:val="18"/>
+              </w:rPr>
+              <w:t>Full Production Turnkey Release</w:t>
+            </w:r>
+          </w:p>
+        </w:tc>
+        <w:tc>
+          <w:tcPr>
+            <w:tcW w:type="dxa" w:w="1296"/>
+            <w:shd w:fill="F8FAFC"/>
+            <w:tcMar>
+              <w:top w:w="100" w:type="dxa"/>
+              <w:bottom w:w="100" w:type="dxa"/>
+              <w:left w:w="140" w:type="dxa"/>
+              <w:right w:w="140" w:type="dxa"/>
+            </w:tcMar>
+          </w:tcPr>
+          <w:p>
+            <w:pPr>
+              <w:spacing w:before="0" w:after="0"/>
+              <w:jc w:val="left"/>
+            </w:pPr>
+            <w:r>
+              <w:rPr>
+                <w:rFonts w:ascii="Calibri" w:hAnsi="Calibri"/>
+                <w:color w:val="1E293B"/>
+                <w:sz w:val="18"/>
+              </w:rPr>
+              <w:t>220 hrs</w:t>
+            </w:r>
+          </w:p>
+        </w:tc>
+        <w:tc>
+          <w:tcPr>
+            <w:tcW w:type="dxa" w:w="1728"/>
+            <w:shd w:fill="F8FAFC"/>
+            <w:tcMar>
+              <w:top w:w="100" w:type="dxa"/>
+              <w:bottom w:w="100" w:type="dxa"/>
+              <w:left w:w="140" w:type="dxa"/>
+              <w:right w:w="140" w:type="dxa"/>
+            </w:tcMar>
+          </w:tcPr>
+          <w:p>
+            <w:pPr>
+              <w:spacing w:before="0" w:after="0"/>
+              <w:jc w:val="left"/>
+            </w:pPr>
+            <w:r>
+              <w:rPr>
+                <w:rFonts w:ascii="Calibri" w:hAnsi="Calibri"/>
+                <w:color w:val="1E293B"/>
+                <w:sz w:val="18"/>
+              </w:rPr>
+              <w:t>$18,900 AUD</w:t>
             </w:r>
           </w:p>
         </w:tc>
@@ -3040,7 +3146,7 @@
           <w:color w:val="1B4D20"/>
           <w:sz w:val="32"/>
         </w:rPr>
-        <w:t>4. Monthly Recurring Operating Costs (OPEX) — Total: $1,790 AUD / mo</w:t>
+        <w:t>4. Monthly Recurring Operating Costs (OPEX) — Total: $280.00 AUD / mo</w:t>
       </w:r>
     </w:p>
     <w:p>
@@ -3254,7 +3360,7 @@
                 <w:color w:val="1E293B"/>
                 <w:sz w:val="18"/>
               </w:rPr>
-              <w:t>$420.00 AUD</w:t>
+              <w:t>$42.00 AUD</w:t>
             </w:r>
           </w:p>
         </w:tc>
@@ -3280,7 +3386,7 @@
                 <w:color w:val="1E293B"/>
                 <w:sz w:val="18"/>
               </w:rPr>
-              <w:t>$5,040 AUD</w:t>
+              <w:t>$504.00 AUD</w:t>
             </w:r>
           </w:p>
         </w:tc>
@@ -3308,7 +3414,7 @@
                 <w:color w:val="1E293B"/>
                 <w:sz w:val="18"/>
               </w:rPr>
-              <w:t>Domain Name &amp; Automated SSL</w:t>
+              <w:t>Domain Name &amp; Cloudflare SSL</w:t>
             </w:r>
           </w:p>
         </w:tc>
@@ -3360,7 +3466,7 @@
                 <w:color w:val="1E293B"/>
                 <w:sz w:val="18"/>
               </w:rPr>
-              <w:t>$20.00 AUD</w:t>
+              <w:t>$6.00 AUD</w:t>
             </w:r>
           </w:p>
         </w:tc>
@@ -3386,7 +3492,7 @@
                 <w:color w:val="1E293B"/>
                 <w:sz w:val="18"/>
               </w:rPr>
-              <w:t>$240 AUD</w:t>
+              <w:t>$72.00 AUD</w:t>
             </w:r>
           </w:p>
         </w:tc>
@@ -3414,7 +3520,7 @@
                 <w:color w:val="1E293B"/>
                 <w:sz w:val="18"/>
               </w:rPr>
-              <w:t>Application Telemetry &amp; Sentry</w:t>
+              <w:t>Transactional SMS &amp; Order Alerts</w:t>
             </w:r>
           </w:p>
         </w:tc>
@@ -3440,7 +3546,7 @@
                 <w:color w:val="1E293B"/>
                 <w:sz w:val="18"/>
               </w:rPr>
-              <w:t>Sentry Performance &amp; Error Tracking</w:t>
+              <w:t>Twilio Australia SMS / Email notifications</w:t>
             </w:r>
           </w:p>
         </w:tc>
@@ -3466,7 +3572,7 @@
                 <w:color w:val="1E293B"/>
                 <w:sz w:val="18"/>
               </w:rPr>
-              <w:t>$150.00 AUD</w:t>
+              <w:t>$32.00 AUD</w:t>
             </w:r>
           </w:p>
         </w:tc>
@@ -3492,7 +3598,7 @@
                 <w:color w:val="1E293B"/>
                 <w:sz w:val="18"/>
               </w:rPr>
-              <w:t>$1,800 AUD</w:t>
+              <w:t>$384.00 AUD</w:t>
             </w:r>
           </w:p>
         </w:tc>
@@ -3520,7 +3626,7 @@
                 <w:color w:val="1E293B"/>
                 <w:sz w:val="18"/>
               </w:rPr>
-              <w:t>Quarterly Security &amp; Biosecurity Audit</w:t>
+              <w:t>Telemetry, Uptime &amp; Daily Backups</w:t>
             </w:r>
           </w:p>
         </w:tc>
@@ -3546,7 +3652,7 @@
                 <w:color w:val="1E293B"/>
                 <w:sz w:val="18"/>
               </w:rPr>
-              <w:t>Australian independent cybersecurity firm</w:t>
+              <w:t>Firestore automated exports &amp; error monitoring</w:t>
             </w:r>
           </w:p>
         </w:tc>
@@ -3572,7 +3678,7 @@
                 <w:color w:val="1E293B"/>
                 <w:sz w:val="18"/>
               </w:rPr>
-              <w:t>$450.00 AUD</w:t>
+              <w:t>$20.00 AUD</w:t>
             </w:r>
           </w:p>
         </w:tc>
@@ -3598,7 +3704,7 @@
                 <w:color w:val="1E293B"/>
                 <w:sz w:val="18"/>
               </w:rPr>
-              <w:t>$5,400 AUD</w:t>
+              <w:t>$240.00 AUD</w:t>
             </w:r>
           </w:p>
         </w:tc>
@@ -3626,7 +3732,7 @@
                 <w:color w:val="1E293B"/>
                 <w:sz w:val="18"/>
               </w:rPr>
-              <w:t>Part-Time DevOps &amp; Operations Support</w:t>
+              <w:t>Part-Time Maintenance &amp; Support</w:t>
             </w:r>
           </w:p>
         </w:tc>
@@ -3652,7 +3758,7 @@
                 <w:color w:val="1E293B"/>
                 <w:sz w:val="18"/>
               </w:rPr>
-              <w:t>System administration, database backups, support</w:t>
+              <w:t>Part-time developer retainer (2.5 hrs/mo @ $72/hr)</w:t>
             </w:r>
           </w:p>
         </w:tc>
@@ -3678,7 +3784,7 @@
                 <w:color w:val="1E293B"/>
                 <w:sz w:val="18"/>
               </w:rPr>
-              <w:t>$750.00 AUD</w:t>
+              <w:t>$180.00 AUD</w:t>
             </w:r>
           </w:p>
         </w:tc>
@@ -3704,7 +3810,7 @@
                 <w:color w:val="1E293B"/>
                 <w:sz w:val="18"/>
               </w:rPr>
-              <w:t>$9,000 AUD</w:t>
+              <w:t>$2,160.00 AUD</w:t>
             </w:r>
           </w:p>
         </w:tc>
@@ -3784,7 +3890,7 @@
                 <w:color w:val="1E293B"/>
                 <w:sz w:val="18"/>
               </w:rPr>
-              <w:t>$1,790.00 AUD / mo</w:t>
+              <w:t>$280.00 AUD / mo</w:t>
             </w:r>
           </w:p>
         </w:tc>
@@ -3810,7 +3916,7 @@
                 <w:color w:val="1E293B"/>
                 <w:sz w:val="18"/>
               </w:rPr>
-              <w:t>$21,480 AUD / yr</w:t>
+              <w:t>$3,360.00 AUD / yr</w:t>
             </w:r>
           </w:p>
         </w:tc>
@@ -3846,7 +3952,7 @@
           <w:color w:val="1E293B"/>
           <w:sz w:val="20"/>
         </w:rPr>
-        <w:t>Below is the commercial 3-year financial model detailing platform expansion from initial Victorian rollout to national Australian adoption:</w:t>
+        <w:t>Below is the commercial 3-year financial model detailing platform expansion from initial Victorian pilot to state-wide adoption:</w:t>
       </w:r>
     </w:p>
     <w:tbl>
@@ -3913,7 +4019,7 @@
                 <w:color w:val="FFFFFF"/>
                 <w:sz w:val="19"/>
               </w:rPr>
-              <w:t>Year 1 (Regional VIC)</w:t>
+              <w:t>Year 1 (Pilot 15 Farms)</w:t>
             </w:r>
           </w:p>
         </w:tc>
@@ -3940,7 +4046,7 @@
                 <w:color w:val="FFFFFF"/>
                 <w:sz w:val="19"/>
               </w:rPr>
-              <w:t>Year 2 (VIC + NSW)</w:t>
+              <w:t>Year 2 (VIC Expansion)</w:t>
             </w:r>
           </w:p>
         </w:tc>
@@ -3967,7 +4073,7 @@
                 <w:color w:val="FFFFFF"/>
                 <w:sz w:val="19"/>
               </w:rPr>
-              <w:t>Year 3 (National Australia)</w:t>
+              <w:t>Year 3 (VIC + NSW Scale)</w:t>
             </w:r>
           </w:p>
         </w:tc>
@@ -4021,7 +4127,7 @@
                 <w:color w:val="1E293B"/>
                 <w:sz w:val="18"/>
               </w:rPr>
-              <w:t>50 Farms</w:t>
+              <w:t>15 Farms</w:t>
             </w:r>
           </w:p>
         </w:tc>
@@ -4047,7 +4153,7 @@
                 <w:color w:val="1E293B"/>
                 <w:sz w:val="18"/>
               </w:rPr>
-              <w:t>180 Farms</w:t>
+              <w:t>45 Farms</w:t>
             </w:r>
           </w:p>
         </w:tc>
@@ -4073,7 +4179,7 @@
                 <w:color w:val="1E293B"/>
                 <w:sz w:val="18"/>
               </w:rPr>
-              <w:t>500 Farms</w:t>
+              <w:t>120 Farms</w:t>
             </w:r>
           </w:p>
         </w:tc>
@@ -4101,7 +4207,7 @@
                 <w:color w:val="1E293B"/>
                 <w:sz w:val="18"/>
               </w:rPr>
-              <w:t>Accredited Wholesalers</w:t>
+              <w:t>Accredited Wholesalers / Buyers</w:t>
             </w:r>
           </w:p>
         </w:tc>
@@ -4127,7 +4233,7 @@
                 <w:color w:val="1E293B"/>
                 <w:sz w:val="18"/>
               </w:rPr>
-              <w:t>25 Wholesalers</w:t>
+              <w:t>8 Buyers</w:t>
             </w:r>
           </w:p>
         </w:tc>
@@ -4153,7 +4259,7 @@
                 <w:color w:val="1E293B"/>
                 <w:sz w:val="18"/>
               </w:rPr>
-              <w:t>75 Wholesalers</w:t>
+              <w:t>24 Buyers</w:t>
             </w:r>
           </w:p>
         </w:tc>
@@ -4179,7 +4285,7 @@
                 <w:color w:val="1E293B"/>
                 <w:sz w:val="18"/>
               </w:rPr>
-              <w:t>180 Wholesalers</w:t>
+              <w:t>60 Buyers</w:t>
             </w:r>
           </w:p>
         </w:tc>
@@ -4233,7 +4339,7 @@
                 <w:color w:val="1E293B"/>
                 <w:sz w:val="18"/>
               </w:rPr>
-              <w:t>$810,000 AUD</w:t>
+              <w:t>$184,800 AUD</w:t>
             </w:r>
           </w:p>
         </w:tc>
@@ -4259,7 +4365,7 @@
                 <w:color w:val="1E293B"/>
                 <w:sz w:val="18"/>
               </w:rPr>
-              <w:t>$3,240,000 AUD</w:t>
+              <w:t>$620,000 AUD</w:t>
             </w:r>
           </w:p>
         </w:tc>
@@ -4285,7 +4391,7 @@
                 <w:color w:val="1E293B"/>
                 <w:sz w:val="18"/>
               </w:rPr>
-              <w:t>$10,800,000 AUD</w:t>
+              <w:t>$1,850,000 AUD</w:t>
             </w:r>
           </w:p>
         </w:tc>
@@ -4313,7 +4419,7 @@
                 <w:color w:val="1E293B"/>
                 <w:sz w:val="18"/>
               </w:rPr>
-              <w:t>Transaction Fees (2.5%)</w:t>
+              <w:t>Transaction Fees (3.0%)</w:t>
             </w:r>
           </w:p>
         </w:tc>
@@ -4339,7 +4445,7 @@
                 <w:color w:val="1E293B"/>
                 <w:sz w:val="18"/>
               </w:rPr>
-              <w:t>$20,250 AUD</w:t>
+              <w:t>$5,544 AUD</w:t>
             </w:r>
           </w:p>
         </w:tc>
@@ -4365,7 +4471,7 @@
                 <w:color w:val="1E293B"/>
                 <w:sz w:val="18"/>
               </w:rPr>
-              <w:t>$81,000 AUD</w:t>
+              <w:t>$18,600 AUD</w:t>
             </w:r>
           </w:p>
         </w:tc>
@@ -4391,7 +4497,7 @@
                 <w:color w:val="1E293B"/>
                 <w:sz w:val="18"/>
               </w:rPr>
-              <w:t>$270,000 AUD</w:t>
+              <w:t>$55,500 AUD</w:t>
             </w:r>
           </w:p>
         </w:tc>
@@ -4419,7 +4525,7 @@
                 <w:color w:val="1E293B"/>
                 <w:sz w:val="18"/>
               </w:rPr>
-              <w:t>Wholesaler Subscriptions</w:t>
+              <w:t>Wholesaler Verification Fees</w:t>
             </w:r>
           </w:p>
         </w:tc>
@@ -4445,7 +4551,7 @@
                 <w:color w:val="1E293B"/>
                 <w:sz w:val="18"/>
               </w:rPr>
-              <w:t>$36,000 AUD</w:t>
+              <w:t>$3,360 AUD</w:t>
             </w:r>
           </w:p>
         </w:tc>
@@ -4471,7 +4577,7 @@
                 <w:color w:val="1E293B"/>
                 <w:sz w:val="18"/>
               </w:rPr>
-              <w:t>$108,000 AUD</w:t>
+              <w:t>$10,080 AUD</w:t>
             </w:r>
           </w:p>
         </w:tc>
@@ -4497,7 +4603,7 @@
                 <w:color w:val="1E293B"/>
                 <w:sz w:val="18"/>
               </w:rPr>
-              <w:t>$259,200 AUD</w:t>
+              <w:t>$25,200 AUD</w:t>
             </w:r>
           </w:p>
         </w:tc>
@@ -4551,7 +4657,7 @@
                 <w:color w:val="1E293B"/>
                 <w:sz w:val="18"/>
               </w:rPr>
-              <w:t>$53,400 AUD</w:t>
+              <w:t>$2,340 AUD</w:t>
             </w:r>
           </w:p>
         </w:tc>
@@ -4577,7 +4683,7 @@
                 <w:color w:val="1E293B"/>
                 <w:sz w:val="18"/>
               </w:rPr>
-              <w:t>$165,000 AUD</w:t>
+              <w:t>$9,720 AUD</w:t>
             </w:r>
           </w:p>
         </w:tc>
@@ -4603,7 +4709,7 @@
                 <w:color w:val="1E293B"/>
                 <w:sz w:val="18"/>
               </w:rPr>
-              <w:t>$420,000 AUD</w:t>
+              <w:t>$32,400 AUD</w:t>
             </w:r>
           </w:p>
         </w:tc>
@@ -4631,7 +4737,7 @@
                 <w:color w:val="1E293B"/>
                 <w:sz w:val="18"/>
               </w:rPr>
-              <w:t>Logistics Coordination Fees</w:t>
+              <w:t>Digital QR Batch Stamp Fees</w:t>
             </w:r>
           </w:p>
         </w:tc>
@@ -4657,7 +4763,7 @@
                 <w:color w:val="1E293B"/>
                 <w:sz w:val="18"/>
               </w:rPr>
-              <w:t>$8,100 AUD</w:t>
+              <w:t>$1,080 AUD</w:t>
             </w:r>
           </w:p>
         </w:tc>
@@ -4683,7 +4789,7 @@
                 <w:color w:val="1E293B"/>
                 <w:sz w:val="18"/>
               </w:rPr>
-              <w:t>$32,400 AUD</w:t>
+              <w:t>$4,200 AUD</w:t>
             </w:r>
           </w:p>
         </w:tc>
@@ -4709,7 +4815,7 @@
                 <w:color w:val="1E293B"/>
                 <w:sz w:val="18"/>
               </w:rPr>
-              <w:t>$108,000 AUD</w:t>
+              <w:t>$15,300 AUD</w:t>
             </w:r>
           </w:p>
         </w:tc>
@@ -4763,7 +4869,7 @@
                 <w:color w:val="1E293B"/>
                 <w:sz w:val="18"/>
               </w:rPr>
-              <w:t>$117,750 AUD</w:t>
+              <w:t>$12,324 AUD</w:t>
             </w:r>
           </w:p>
         </w:tc>
@@ -4789,7 +4895,7 @@
                 <w:color w:val="1E293B"/>
                 <w:sz w:val="18"/>
               </w:rPr>
-              <w:t>$386,400 AUD</w:t>
+              <w:t>$42,600 AUD</w:t>
             </w:r>
           </w:p>
         </w:tc>
@@ -4815,7 +4921,7 @@
                 <w:color w:val="1E293B"/>
                 <w:sz w:val="18"/>
               </w:rPr>
-              <w:t>$1,057,200 AUD</w:t>
+              <w:t>$128,400 AUD</w:t>
             </w:r>
           </w:p>
         </w:tc>
@@ -4869,7 +4975,7 @@
                 <w:color w:val="1E293B"/>
                 <w:sz w:val="18"/>
               </w:rPr>
-              <w:t>($21,480 AUD)</w:t>
+              <w:t>($3,360 AUD)</w:t>
             </w:r>
           </w:p>
         </w:tc>
@@ -4895,7 +5001,7 @@
                 <w:color w:val="1E293B"/>
                 <w:sz w:val="18"/>
               </w:rPr>
-              <w:t>($48,000 AUD)</w:t>
+              <w:t>($7,200 AUD)</w:t>
             </w:r>
           </w:p>
         </w:tc>
@@ -4921,7 +5027,7 @@
                 <w:color w:val="1E293B"/>
                 <w:sz w:val="18"/>
               </w:rPr>
-              <w:t>($120,000 AUD)</w:t>
+              <w:t>($18,000 AUD)</w:t>
             </w:r>
           </w:p>
         </w:tc>
@@ -4975,7 +5081,7 @@
                 <w:color w:val="1E293B"/>
                 <w:sz w:val="18"/>
               </w:rPr>
-              <w:t>$96,270 AUD</w:t>
+              <w:t>$8,964 AUD</w:t>
             </w:r>
           </w:p>
         </w:tc>
@@ -5001,7 +5107,7 @@
                 <w:color w:val="1E293B"/>
                 <w:sz w:val="18"/>
               </w:rPr>
-              <w:t>$338,400 AUD</w:t>
+              <w:t>$35,400 AUD</w:t>
             </w:r>
           </w:p>
         </w:tc>
@@ -5027,7 +5133,7 @@
                 <w:color w:val="1E293B"/>
                 <w:sz w:val="18"/>
               </w:rPr>
-              <w:t>$937,200 AUD</w:t>
+              <w:t>$110,400 AUD</w:t>
             </w:r>
           </w:p>
         </w:tc>
@@ -5050,7 +5156,7 @@
           <w:color w:val="1B4D20"/>
           <w:sz w:val="32"/>
         </w:rPr>
-        <w:t>6. Small Family Farm Economic Impact &amp; Payback</w:t>
+        <w:t>6. Small Family Farm Economic Impact &amp; Real Money Gain</w:t>
       </w:r>
     </w:p>
     <w:p>
@@ -5063,7 +5169,7 @@
           <w:color w:val="1E293B"/>
           <w:sz w:val="20"/>
         </w:rPr>
-        <w:t>The economic benefit to small family producers is profound:</w:t>
+        <w:t>The economic benefit to small family producers is grounded in authentic Australian farm-gate produce economics:</w:t>
       </w:r>
     </w:p>
     <w:p>
@@ -5078,7 +5184,7 @@
           <w:color w:val="1E293B"/>
           <w:sz w:val="20"/>
         </w:rPr>
-        <w:t xml:space="preserve">Supermarket Model: </w:t>
+        <w:t xml:space="preserve">Duopoly Reality: </w:t>
       </w:r>
       <w:r>
         <w:rPr>
@@ -5086,7 +5192,7 @@
           <w:color w:val="1E293B"/>
           <w:sz w:val="20"/>
         </w:rPr>
-        <w:t>Supermarket Duopoly Baseline: A small strawberry grower in the Yarra Valley typically receives $2.20 AUD per 500g punnet from duopoly buyers, while retail consumers are charged $6.50 AUD (Grower margin: ~33%).</w:t>
+        <w:t>Supermarket Duopoly Baseline: A small strawberry grower in the Yarra Valley typically receives $1.80 AUD per 500g punnet from duopoly buyers, while retail consumers are charged $5.50 AUD in store (Grower retains only 32.7% of retail value). Up to 18% of edible stock is cosmetically rejected without payment.</w:t>
       </w:r>
     </w:p>
     <w:p>
@@ -5109,7 +5215,7 @@
           <w:color w:val="1E293B"/>
           <w:sz w:val="20"/>
         </w:rPr>
-        <w:t>AgriTrace Direct Model: The grower lists at $4.60 AUD per punnet. The consumer pays $5.50 AUD (cheaper than supermarkets). After the 2.5% platform fee ($0.11 AUD), the farmer nets $4.49 AUD per punnet — a +104% increase in net revenue per unit.</w:t>
+        <w:t>AgriTrace Direct Model: The grower lists at $4.20 AUD per punnet (consumers pay $1.30 less than supermarket price). After the 3.0% platform fee ($0.13 AUD) and local transit deduction ($0.55 AUD), the farmer nets $3.52 AUD per punnet — a +95.5% increase in net revenue per unit.</w:t>
       </w:r>
     </w:p>
     <w:p>
@@ -5124,7 +5230,7 @@
           <w:color w:val="1E293B"/>
           <w:sz w:val="20"/>
         </w:rPr>
-        <w:t xml:space="preserve">Net Farmer Gain: </w:t>
+        <w:t xml:space="preserve">Annual Farm Gain: </w:t>
       </w:r>
       <w:r>
         <w:rPr>
@@ -5132,7 +5238,30 @@
           <w:color w:val="1E293B"/>
           <w:sz w:val="20"/>
         </w:rPr>
-        <w:t>Annual Farm Income Gain: An average family producer harvesting 8,000 units annually gains +$18,320 AUD in additional net profit, completely transforming rural farm viability.</w:t>
+        <w:t>Real Money Gain per Farm: For a small family grower harvesting 6,000 units per season, net income rises from $10,800 AUD to $21,120 AUD, delivering +$10,320.00 AUD in extra cash profit directly into the family farm's bank account.</w:t>
+      </w:r>
+    </w:p>
+    <w:p>
+      <w:pPr>
+        <w:pStyle w:val="ListBullet"/>
+        <w:spacing w:before="0" w:after="60" w:line="276" w:lineRule="auto"/>
+      </w:pPr>
+      <w:r>
+        <w:rPr>
+          <w:rFonts w:ascii="Calibri" w:hAnsi="Calibri"/>
+          <w:b/>
+          <w:color w:val="1E293B"/>
+          <w:sz w:val="20"/>
+        </w:rPr>
+        <w:t xml:space="preserve">Cooperative Impact: </w:t>
+      </w:r>
+      <w:r>
+        <w:rPr>
+          <w:rFonts w:ascii="Calibri" w:hAnsi="Calibri"/>
+          <w:color w:val="1E293B"/>
+          <w:sz w:val="20"/>
+        </w:rPr>
+        <w:t>Collective Rural Wealth: Across the 15 pilot farms, over $154,800.00 AUD in collective additional income is retained by local rural producers rather than lost to corporate supermarket margins.</w:t>
       </w:r>
     </w:p>
     <w:p>
@@ -5143,7 +5272,7 @@
       <w:r>
         <w:drawing>
           <wp:inline xmlns:a="http://schemas.openxmlformats.org/drawingml/2006/main" xmlns:pic="http://schemas.openxmlformats.org/drawingml/2006/picture">
-            <wp:extent cx="5486400" cy="4114800"/>
+            <wp:extent cx="5486400" cy="3587262"/>
             <wp:docPr id="3" name="Picture 3"/>
             <wp:cNvGraphicFramePr>
               <a:graphicFrameLocks noChangeAspect="1"/>
@@ -5164,7 +5293,7 @@
                   <pic:spPr>
                     <a:xfrm>
                       <a:off x="0" y="0"/>
-                      <a:ext cx="5486400" cy="4114800"/>
+                      <a:ext cx="5486400" cy="3587262"/>
                     </a:xfrm>
                     <a:prstGeom prst="rect"/>
                   </pic:spPr>

</xml_diff>